<commit_message>
Update `pages.docx` in the report documents.
</commit_message>
<xml_diff>
--- a/report/other_pages/pages.docx
+++ b/report/other_pages/pages.docx
@@ -7,12 +7,6 @@
         <w:pStyle w:val="Title"/>
       </w:pPr>
       <w:r>
-        <w:t>Page1</w:t>
-      </w:r>
-      <w:r>
-        <w:t xml:space="preserve"> </w:t>
-      </w:r>
-      <w:r>
         <w:t>york.html</w:t>
       </w:r>
     </w:p>
@@ -21,8 +15,13 @@
         <w:pStyle w:val="Heading1"/>
       </w:pPr>
       <w:r>
-        <w:t>H1 bla</w:t>
-      </w:r>
+        <w:t xml:space="preserve">H1 </w:t>
+      </w:r>
+      <w:proofErr w:type="spellStart"/>
+      <w:r>
+        <w:t>bla</w:t>
+      </w:r>
+      <w:proofErr w:type="spellEnd"/>
       <w:r>
         <w:t xml:space="preserve"> </w:t>
       </w:r>
@@ -79,8 +78,21 @@
         <w:pStyle w:val="Heading2"/>
       </w:pPr>
       <w:r>
-        <w:t>H2 bla bla</w:t>
-      </w:r>
+        <w:t xml:space="preserve">H2 </w:t>
+      </w:r>
+      <w:proofErr w:type="spellStart"/>
+      <w:r>
+        <w:t>bla</w:t>
+      </w:r>
+      <w:proofErr w:type="spellEnd"/>
+      <w:r>
+        <w:t xml:space="preserve"> </w:t>
+      </w:r>
+      <w:proofErr w:type="spellStart"/>
+      <w:r>
+        <w:t>bla</w:t>
+      </w:r>
+      <w:proofErr w:type="spellEnd"/>
     </w:p>
     <w:p>
       <w:r>
@@ -201,8 +213,29 @@
         <w:pStyle w:val="Heading3"/>
       </w:pPr>
       <w:r>
-        <w:t>H3 bla bla bla</w:t>
-      </w:r>
+        <w:t xml:space="preserve">H3 </w:t>
+      </w:r>
+      <w:proofErr w:type="spellStart"/>
+      <w:r>
+        <w:t>bla</w:t>
+      </w:r>
+      <w:proofErr w:type="spellEnd"/>
+      <w:r>
+        <w:t xml:space="preserve"> </w:t>
+      </w:r>
+      <w:proofErr w:type="spellStart"/>
+      <w:r>
+        <w:t>bla</w:t>
+      </w:r>
+      <w:proofErr w:type="spellEnd"/>
+      <w:r>
+        <w:t xml:space="preserve"> </w:t>
+      </w:r>
+      <w:proofErr w:type="spellStart"/>
+      <w:r>
+        <w:t>bla</w:t>
+      </w:r>
+      <w:proofErr w:type="spellEnd"/>
     </w:p>
     <w:p>
       <w:r>
@@ -214,10 +247,7 @@
         <w:pStyle w:val="Title"/>
       </w:pPr>
       <w:r>
-        <w:t>Page2</w:t>
-      </w:r>
-      <w:r>
-        <w:t xml:space="preserve"> london.html</w:t>
+        <w:t>london.html</w:t>
       </w:r>
     </w:p>
     <w:p>
@@ -225,8 +255,13 @@
         <w:pStyle w:val="Heading1"/>
       </w:pPr>
       <w:r>
-        <w:t>H1 bla</w:t>
-      </w:r>
+        <w:t xml:space="preserve">H1 </w:t>
+      </w:r>
+      <w:proofErr w:type="spellStart"/>
+      <w:r>
+        <w:t>bla</w:t>
+      </w:r>
+      <w:proofErr w:type="spellEnd"/>
     </w:p>
     <w:p>
       <w:r>
@@ -284,8 +319,21 @@
         <w:pStyle w:val="Heading1"/>
       </w:pPr>
       <w:r>
-        <w:t>H2 bla bla</w:t>
-      </w:r>
+        <w:t xml:space="preserve">H2 </w:t>
+      </w:r>
+      <w:proofErr w:type="spellStart"/>
+      <w:r>
+        <w:t>bla</w:t>
+      </w:r>
+      <w:proofErr w:type="spellEnd"/>
+      <w:r>
+        <w:t xml:space="preserve"> </w:t>
+      </w:r>
+      <w:proofErr w:type="spellStart"/>
+      <w:r>
+        <w:t>bla</w:t>
+      </w:r>
+      <w:proofErr w:type="spellEnd"/>
     </w:p>
     <w:p>
       <w:r>

</xml_diff>

<commit_message>
Add new `pandoc` command for converting `pages.docx` to JSON in local settings.
</commit_message>
<xml_diff>
--- a/report/other_pages/pages.docx
+++ b/report/other_pages/pages.docx
@@ -7,7 +7,7 @@
         <w:pStyle w:val="Title"/>
       </w:pPr>
       <w:r>
-        <w:t>york.html</w:t>
+        <w:t>York</w:t>
       </w:r>
     </w:p>
     <w:p>
@@ -15,13 +15,8 @@
         <w:pStyle w:val="Heading1"/>
       </w:pPr>
       <w:r>
-        <w:t xml:space="preserve">H1 </w:t>
+        <w:t>H1 bla</w:t>
       </w:r>
-      <w:proofErr w:type="spellStart"/>
-      <w:r>
-        <w:t>bla</w:t>
-      </w:r>
-      <w:proofErr w:type="spellEnd"/>
       <w:r>
         <w:t xml:space="preserve"> </w:t>
       </w:r>
@@ -78,21 +73,8 @@
         <w:pStyle w:val="Heading2"/>
       </w:pPr>
       <w:r>
-        <w:t xml:space="preserve">H2 </w:t>
+        <w:t>H2 bla bla</w:t>
       </w:r>
-      <w:proofErr w:type="spellStart"/>
-      <w:r>
-        <w:t>bla</w:t>
-      </w:r>
-      <w:proofErr w:type="spellEnd"/>
-      <w:r>
-        <w:t xml:space="preserve"> </w:t>
-      </w:r>
-      <w:proofErr w:type="spellStart"/>
-      <w:r>
-        <w:t>bla</w:t>
-      </w:r>
-      <w:proofErr w:type="spellEnd"/>
     </w:p>
     <w:p>
       <w:r>
@@ -213,29 +195,8 @@
         <w:pStyle w:val="Heading3"/>
       </w:pPr>
       <w:r>
-        <w:t xml:space="preserve">H3 </w:t>
+        <w:t>H3 bla bla bla</w:t>
       </w:r>
-      <w:proofErr w:type="spellStart"/>
-      <w:r>
-        <w:t>bla</w:t>
-      </w:r>
-      <w:proofErr w:type="spellEnd"/>
-      <w:r>
-        <w:t xml:space="preserve"> </w:t>
-      </w:r>
-      <w:proofErr w:type="spellStart"/>
-      <w:r>
-        <w:t>bla</w:t>
-      </w:r>
-      <w:proofErr w:type="spellEnd"/>
-      <w:r>
-        <w:t xml:space="preserve"> </w:t>
-      </w:r>
-      <w:proofErr w:type="spellStart"/>
-      <w:r>
-        <w:t>bla</w:t>
-      </w:r>
-      <w:proofErr w:type="spellEnd"/>
     </w:p>
     <w:p>
       <w:r>
@@ -247,7 +208,10 @@
         <w:pStyle w:val="Title"/>
       </w:pPr>
       <w:r>
-        <w:t>london.html</w:t>
+        <w:t>L</w:t>
+      </w:r>
+      <w:r>
+        <w:t>ondon</w:t>
       </w:r>
     </w:p>
     <w:p>
@@ -255,13 +219,8 @@
         <w:pStyle w:val="Heading1"/>
       </w:pPr>
       <w:r>
-        <w:t xml:space="preserve">H1 </w:t>
+        <w:t>H1 bla</w:t>
       </w:r>
-      <w:proofErr w:type="spellStart"/>
-      <w:r>
-        <w:t>bla</w:t>
-      </w:r>
-      <w:proofErr w:type="spellEnd"/>
     </w:p>
     <w:p>
       <w:r>
@@ -319,21 +278,8 @@
         <w:pStyle w:val="Heading1"/>
       </w:pPr>
       <w:r>
-        <w:t xml:space="preserve">H2 </w:t>
+        <w:t>H2 bla bla</w:t>
       </w:r>
-      <w:proofErr w:type="spellStart"/>
-      <w:r>
-        <w:t>bla</w:t>
-      </w:r>
-      <w:proofErr w:type="spellEnd"/>
-      <w:r>
-        <w:t xml:space="preserve"> </w:t>
-      </w:r>
-      <w:proofErr w:type="spellStart"/>
-      <w:r>
-        <w:t>bla</w:t>
-      </w:r>
-      <w:proofErr w:type="spellEnd"/>
     </w:p>
     <w:p>
       <w:r>

</xml_diff>